<commit_message>
feat: optimize police review workflow and diagnostics
</commit_message>
<xml_diff>
--- a/output/doc/01-基本完整-电诈询问笔录.docx
+++ b/output/doc/01-基本完整-电诈询问笔录.docx
@@ -663,6 +663,116 @@
                 <w:color w:val="324052"/>
                 <w:sz w:val="19"/>
               </w:rPr>
+              <w:t>年龄</w:t>
+            </w:r>
+          </w:p>
+        </w:tc>
+        <w:tc>
+          <w:tcPr>
+            <w:tcW w:type="dxa" w:w="2948"/>
+            <w:vAlign w:val="center"/>
+            <w:tcMar>
+              <w:top w:w="100" w:type="dxa"/>
+              <w:start w:w="120" w:type="dxa"/>
+              <w:bottom w:w="100" w:type="dxa"/>
+              <w:end w:w="120" w:type="dxa"/>
+            </w:tcMar>
+          </w:tcPr>
+          <w:p>
+            <w:pPr>
+              <w:spacing w:after="0"/>
+            </w:pPr>
+            <w:r/>
+            <w:r>
+              <w:rPr>
+                <w:rFonts w:ascii="宋体" w:hAnsi="宋体" w:eastAsia="宋体"/>
+                <w:b w:val="0"/>
+                <w:sz w:val="19"/>
+              </w:rPr>
+              <w:t>36岁</w:t>
+            </w:r>
+          </w:p>
+        </w:tc>
+        <w:tc>
+          <w:tcPr>
+            <w:tcW w:type="dxa" w:w="1247"/>
+            <w:vAlign w:val="center"/>
+            <w:tcMar>
+              <w:top w:w="100" w:type="dxa"/>
+              <w:start w:w="120" w:type="dxa"/>
+              <w:bottom w:w="100" w:type="dxa"/>
+              <w:end w:w="120" w:type="dxa"/>
+            </w:tcMar>
+            <w:shd w:fill="EAF1F8"/>
+          </w:tcPr>
+          <w:p>
+            <w:pPr>
+              <w:spacing w:after="0"/>
+            </w:pPr>
+            <w:r/>
+            <w:r>
+              <w:rPr>
+                <w:rFonts w:ascii="宋体" w:hAnsi="宋体" w:eastAsia="宋体"/>
+                <w:b/>
+                <w:color w:val="324052"/>
+                <w:sz w:val="19"/>
+              </w:rPr>
+              <w:t>民族</w:t>
+            </w:r>
+          </w:p>
+        </w:tc>
+        <w:tc>
+          <w:tcPr>
+            <w:tcW w:type="dxa" w:w="3572"/>
+            <w:vAlign w:val="center"/>
+            <w:tcMar>
+              <w:top w:w="100" w:type="dxa"/>
+              <w:start w:w="120" w:type="dxa"/>
+              <w:bottom w:w="100" w:type="dxa"/>
+              <w:end w:w="120" w:type="dxa"/>
+            </w:tcMar>
+          </w:tcPr>
+          <w:p>
+            <w:pPr>
+              <w:spacing w:after="0"/>
+            </w:pPr>
+            <w:r/>
+            <w:r>
+              <w:rPr>
+                <w:rFonts w:ascii="宋体" w:hAnsi="宋体" w:eastAsia="宋体"/>
+                <w:b w:val="0"/>
+                <w:sz w:val="19"/>
+              </w:rPr>
+              <w:t>汉族</w:t>
+            </w:r>
+          </w:p>
+        </w:tc>
+      </w:tr>
+      <w:tr>
+        <w:tc>
+          <w:tcPr>
+            <w:tcW w:type="dxa" w:w="1247"/>
+            <w:vAlign w:val="center"/>
+            <w:tcMar>
+              <w:top w:w="100" w:type="dxa"/>
+              <w:start w:w="120" w:type="dxa"/>
+              <w:bottom w:w="100" w:type="dxa"/>
+              <w:end w:w="120" w:type="dxa"/>
+            </w:tcMar>
+            <w:shd w:fill="EAF1F8"/>
+          </w:tcPr>
+          <w:p>
+            <w:pPr>
+              <w:spacing w:after="0"/>
+            </w:pPr>
+            <w:r/>
+            <w:r>
+              <w:rPr>
+                <w:rFonts w:ascii="宋体" w:hAnsi="宋体" w:eastAsia="宋体"/>
+                <w:b/>
+                <w:color w:val="324052"/>
+                <w:sz w:val="19"/>
+              </w:rPr>
               <w:t>出生日期</w:t>
             </w:r>
           </w:p>
@@ -827,7 +937,7 @@
                 <w:color w:val="324052"/>
                 <w:sz w:val="19"/>
               </w:rPr>
-              <w:t>职业</w:t>
+              <w:t>工作单位</w:t>
             </w:r>
           </w:p>
         </w:tc>
@@ -853,7 +963,7 @@
                 <w:b w:val="0"/>
                 <w:sz w:val="19"/>
               </w:rPr>
-              <w:t>测试科技有限公司项目专员（虚构）</w:t>
+              <w:t>测试科技有限公司（虚构）</w:t>
             </w:r>
           </w:p>
         </w:tc>
@@ -1721,9 +1831,9 @@
             <w:tcW w:type="dxa" w:w="4535"/>
             <w:vAlign w:val="center"/>
             <w:tcMar>
-              <w:top w:w="100" w:type="dxa"/>
+              <w:top w:w="40" w:type="dxa"/>
               <w:start w:w="120" w:type="dxa"/>
-              <w:bottom w:w="100" w:type="dxa"/>
+              <w:bottom w:w="40" w:type="dxa"/>
               <w:end w:w="120" w:type="dxa"/>
             </w:tcMar>
           </w:tcPr>
@@ -1747,9 +1857,9 @@
             <w:tcW w:type="dxa" w:w="4535"/>
             <w:vAlign w:val="center"/>
             <w:tcMar>
-              <w:top w:w="100" w:type="dxa"/>
+              <w:top w:w="40" w:type="dxa"/>
               <w:start w:w="120" w:type="dxa"/>
-              <w:bottom w:w="100" w:type="dxa"/>
+              <w:bottom w:w="40" w:type="dxa"/>
               <w:end w:w="120" w:type="dxa"/>
             </w:tcMar>
           </w:tcPr>
@@ -1775,9 +1885,9 @@
             <w:tcW w:type="dxa" w:w="4535"/>
             <w:vAlign w:val="center"/>
             <w:tcMar>
-              <w:top w:w="100" w:type="dxa"/>
+              <w:top w:w="40" w:type="dxa"/>
               <w:start w:w="120" w:type="dxa"/>
-              <w:bottom w:w="100" w:type="dxa"/>
+              <w:bottom w:w="40" w:type="dxa"/>
               <w:end w:w="120" w:type="dxa"/>
             </w:tcMar>
           </w:tcPr>
@@ -1801,9 +1911,9 @@
             <w:tcW w:type="dxa" w:w="4535"/>
             <w:vAlign w:val="center"/>
             <w:tcMar>
-              <w:top w:w="100" w:type="dxa"/>
+              <w:top w:w="40" w:type="dxa"/>
               <w:start w:w="120" w:type="dxa"/>
-              <w:bottom w:w="100" w:type="dxa"/>
+              <w:bottom w:w="40" w:type="dxa"/>
               <w:end w:w="120" w:type="dxa"/>
             </w:tcMar>
           </w:tcPr>
@@ -1829,9 +1939,9 @@
             <w:tcW w:type="dxa" w:w="4535"/>
             <w:vAlign w:val="center"/>
             <w:tcMar>
-              <w:top w:w="100" w:type="dxa"/>
+              <w:top w:w="40" w:type="dxa"/>
               <w:start w:w="120" w:type="dxa"/>
-              <w:bottom w:w="100" w:type="dxa"/>
+              <w:bottom w:w="40" w:type="dxa"/>
               <w:end w:w="120" w:type="dxa"/>
             </w:tcMar>
           </w:tcPr>
@@ -1855,9 +1965,9 @@
             <w:tcW w:type="dxa" w:w="4535"/>
             <w:vAlign w:val="center"/>
             <w:tcMar>
-              <w:top w:w="100" w:type="dxa"/>
+              <w:top w:w="40" w:type="dxa"/>
               <w:start w:w="120" w:type="dxa"/>
-              <w:bottom w:w="100" w:type="dxa"/>
+              <w:bottom w:w="40" w:type="dxa"/>
               <w:end w:w="120" w:type="dxa"/>
             </w:tcMar>
           </w:tcPr>
@@ -1880,7 +1990,7 @@
     </w:tbl>
     <w:p>
       <w:pPr>
-        <w:spacing w:before="240" w:after="0"/>
+        <w:spacing w:before="80" w:after="0"/>
         <w:jc w:val="center"/>
       </w:pPr>
       <w:r>

</xml_diff>

<commit_message>
feat: harden template review quality workflow
</commit_message>
<xml_diff>
--- a/output/doc/01-基本完整-电诈询问笔录.docx
+++ b/output/doc/01-基本完整-电诈询问笔录.docx
@@ -853,7 +853,7 @@
                 <w:b w:val="0"/>
                 <w:sz w:val="19"/>
               </w:rPr>
-              <w:t>110101199002030017</w:t>
+              <w:t>ID_TEST_CASE_01</w:t>
             </w:r>
           </w:p>
         </w:tc>
@@ -909,7 +909,7 @@
                 <w:b w:val="0"/>
                 <w:sz w:val="19"/>
               </w:rPr>
-              <w:t>13800000001</w:t>
+              <w:t>PHONE_TEST_01</w:t>
             </w:r>
           </w:p>
         </w:tc>
@@ -1188,7 +1188,7 @@
           <w:b w:val="0"/>
           <w:sz w:val="22"/>
         </w:rPr>
-        <w:t>答：我叫张测试，男，1990年2月3日出生，身份证号码110101199002030017，手机号13800000001，现住测试省测试市演示区样例街10号101室，在测试科技有限公司担任项目专员。以上均为虚构测试信息。</w:t>
+        <w:t>答：我叫张测试，男，1990年2月3日出生，身份证号码ID_TEST_CASE_01，手机号PHONE_TEST_01，现住测试省测试市演示区样例街10号101室，在测试科技有限公司担任项目专员。以上均为虚构测试信息。</w:t>
       </w:r>
     </w:p>
     <w:p>
@@ -1317,7 +1317,7 @@
           <w:b w:val="0"/>
           <w:sz w:val="22"/>
         </w:rPr>
-        <w:t>答：最初在短视频平台联系，对方平台账号为video_test_001；后来使用微信联系，对方微信号wx_service_test_001，我的微信号wx_test_20260716_a；APP登录账号为app_user_test_001，绑定手机号13800000001。</w:t>
+        <w:t>答：最初在短视频平台联系，对方平台账号为video_test_001；后来使用微信联系，对方微信号wx_service_test_001，我的微信号ACCOUNT_WX_CASE_01；APP登录账号为app_user_test_001，绑定手机号PHONE_TEST_01。</w:t>
       </w:r>
     </w:p>
     <w:p>
@@ -1403,7 +1403,7 @@
           <w:b w:val="0"/>
           <w:sz w:val="22"/>
         </w:rPr>
-        <w:t>答：APP名称为优选任务测试版，下载链接为https://download.example.test/app/case001，2026年7月15日19时55分安装，安装包文件名task-demo-001.apk，当前仍可打开，版本号1.0.1-test。</w:t>
+        <w:t>答：APP名称为优选任务测试版，下载链接为URL_TEST_CASE_01，2026年7月15日19时55分安装，安装包文件名task-demo-001.apk，当前仍可打开，版本号1.0.1-test。</w:t>
       </w:r>
     </w:p>
     <w:p>
@@ -1446,7 +1446,7 @@
           <w:b w:val="0"/>
           <w:sz w:val="22"/>
         </w:rPr>
-        <w:t>答：我使用的测试银行卡为工商银行测试卡6222020200001234567，开户名张测试；支付宝测试账号pay_test_001，绑定手机号13800000001。</w:t>
+        <w:t>答：我使用的测试银行卡为工商银行测试卡CARD_TEST_03，开户名张测试；支付宝测试账号pay_test_001，绑定手机号PHONE_TEST_01。</w:t>
       </w:r>
     </w:p>
     <w:p>
@@ -1489,7 +1489,7 @@
           <w:b w:val="0"/>
           <w:sz w:val="22"/>
         </w:rPr>
-        <w:t>答：第一笔于2026年7月15日20时18分转账1000元，收款测试卡号6222020200007654321，户名王演示，流水号：TEST202607150001。</w:t>
+        <w:t>答：第一笔于2026年7月15日20时18分转账1000元，收款测试卡号CARD_TEST_14，户名王演示，流水号：TEST202607150001。</w:t>
       </w:r>
     </w:p>
     <w:p>
@@ -1532,7 +1532,7 @@
           <w:b w:val="0"/>
           <w:sz w:val="22"/>
         </w:rPr>
-        <w:t>答：第二笔于2026年7月15日20时42分转账3000元，收款测试卡号6222020200007654321，户名王演示，流水号：TEST202607150002。</w:t>
+        <w:t>答：第二笔于2026年7月15日20时42分转账3000元，收款测试卡号CARD_TEST_14，户名王演示，流水号：TEST202607150002。</w:t>
       </w:r>
     </w:p>
     <w:p>
@@ -1747,7 +1747,7 @@
           <w:b w:val="0"/>
           <w:sz w:val="22"/>
         </w:rPr>
-        <w:t>答：使用的是测试手机TEST-PHONE-001，设备IMEI测试值860000000000001，案发时连接家庭测试网络，公网IP记录值198.51.100.11。聊天截图、银行流水和APK安装包均可提交。</w:t>
+        <w:t>答：使用的是测试手机TEST-PHONE-001，设备IMEI测试值860000000000001，案发时连接家庭测试网络，公网IP记录值IP_TEST_CASE_01。聊天截图、银行流水和APK安装包均可提交。</w:t>
       </w:r>
     </w:p>
     <w:p>

</xml_diff>